<commit_message>
Sync portfolio with updated resume
</commit_message>
<xml_diff>
--- a/YuxiZhao Resume.docx
+++ b/YuxiZhao Resume.docx
@@ -22,16 +22,34 @@
       <w:pPr>
         <w:spacing w:after="480"/>
         <w:jc w:val="center"/>
+        <w:rPr>
+          <w:rFonts w:hint="default" w:ascii="Arial Regular" w:hAnsi="Arial Regular" w:cs="Arial Regular"/>
+          <w:sz w:val="20"/>
+          <w:szCs w:val="20"/>
+        </w:rPr>
       </w:pPr>
       <w:r>
         <w:rPr>
-          <w:rFonts w:ascii="Arial" w:hAnsi="Arial"/>
+          <w:rFonts w:hint="default" w:ascii="Arial Regular" w:hAnsi="Arial Regular" w:cs="Arial Regular"/>
           <w:b w:val="0"/>
           <w:i w:val="0"/>
           <w:color w:val="333333"/>
           <w:sz w:val="20"/>
+          <w:szCs w:val="20"/>
         </w:rPr>
-        <w:t>Email: aaaapril0408@gmail.com   |   Tel: +86 15194646852 / +44 07421732173</w:t>
+        <w:t xml:space="preserve">Email: aaaapril0408@gmail.com   |   Tel: +86 15194646852  |  </w:t>
+      </w:r>
+      <w:r>
+        <w:rPr>
+          <w:rFonts w:hint="default" w:ascii="Arial Regular" w:hAnsi="Arial Regular" w:eastAsia="宋体" w:cs="Arial Regular"/>
+          <w:color w:val="0000FF"/>
+          <w:spacing w:val="-11"/>
+          <w:sz w:val="20"/>
+          <w:szCs w:val="20"/>
+          <w:u w:val="single"/>
+          <w:lang w:val="en-US" w:eastAsia="zh-CN"/>
+        </w:rPr>
+        <w:t>https://aaaapril0408-max.github.io/portfolio/</w:t>
       </w:r>
     </w:p>
     <w:p>
@@ -52,6 +70,8 @@
         </w:rPr>
         <w:t>EDUCATION</w:t>
       </w:r>
+      <w:bookmarkStart w:id="0" w:name="_GoBack"/>
+      <w:bookmarkEnd w:id="0"/>
     </w:p>
     <w:p>
       <w:pPr>
@@ -252,8 +272,6 @@
         </w:rPr>
         <w:t>.6</w:t>
       </w:r>
-      <w:bookmarkStart w:id="0" w:name="_GoBack"/>
-      <w:bookmarkEnd w:id="0"/>
     </w:p>
     <w:p>
       <w:pPr>

</xml_diff>